<commit_message>
Organize folder structure, delete unwanted artifacts, and finalize TeleMed-M3 publication package
</commit_message>
<xml_diff>
--- a/docs/SRS/final/TeleMed_Software_Requirements_Specification.docx
+++ b/docs/SRS/final/TeleMed_Software_Requirements_Specification.docx
@@ -139,12 +139,7 @@
         <w:spacing w:before="0" w:after="100" w:line="276" w:lineRule="auto"/>
       </w:pPr>
       <w:r>
-        <w:rPr>
-          <w:rFonts w:ascii="Calibri" w:hAnsi="Calibri"/>
-          <w:color w:val="1A202C"/>
-          <w:sz w:val="21"/>
-        </w:rPr>
-        <w:t>TeleMed is an advanced AI-assisted telemedicine decision-support platform designed to address the fragmented nature of contemporary digital health systems. Traditional telemedicine frameworks rely almost exclusively on episodic clinical laboratory data, failing to synthesize continuous physiological telemetry from wearable sensors and metabolic multi-omics data from the human gut microbiome. TeleMed resolves this gap by providing a unified, multi-modal diagnostic engine that integrates three distinct health modalities: (1) Clinical Laboratory &amp; Biomarker Data (18 features), (2) Continuous Wearable &amp; Continuous Glucose Monitoring (CGM) Telemetry (15 features), and (3) 16S rRNA / Metagenomic Gut Microbiome Profiles (40 bacterial taxa and 9 derived ecological/functional indices).</w:t>
+        <w:t>TeleMed is an advanced AI-assisted telemedicine decision-support platform designed to address the fragmented nature of contemporary digital health systems. Traditional telemedicine frameworks rely almost exclusively on episodic clinical laboratory data, failing to synthesize continuous physiological telemetry from wearable sensors and metabolic multi-omics data from the human gut microbiome. TeleMed resolves this gap by providing a unified, multi-modal diagnostic engine that integrates three distinct health modalities: (1) Clinical Laboratory &amp; Biomarker Data (18 features), (2) Continuous Wearable &amp; Continuous Glucose Monitoring (CGM) Telemetry (15 features), and (3) 16S rRNA / Metagenomic Gut Microbiome Profiles (41 bacterial taxa and 9 derived ecological/functional indices).</w:t>
       </w:r>
     </w:p>
     <w:p>
@@ -5156,21 +5151,7 @@
         <w:spacing w:before="0" w:after="100" w:line="276" w:lineRule="auto"/>
       </w:pPr>
       <w:r>
-        <w:rPr>
-          <w:rFonts w:ascii="Calibri" w:hAnsi="Calibri"/>
-          <w:b/>
-          <w:color w:val="1A202C"/>
-          <w:sz w:val="21"/>
-        </w:rPr>
-        <w:t xml:space="preserve">8. Gut Microbiome Expert Module: </w:t>
-      </w:r>
-      <w:r>
-        <w:rPr>
-          <w:rFonts w:ascii="Calibri" w:hAnsi="Calibri"/>
-          <w:color w:val="1A202C"/>
-          <w:sz w:val="21"/>
-        </w:rPr>
-        <w:t>Executes CatBoost model trained on 40 bacterial taxa and 9 ecological/functional indices. (Interacts with Validation Module, Fusion Engine.)</w:t>
+        <w:t>8. Gut Microbiome Expert Module: Executes CatBoost model trained on 41 bacterial taxa and 9 ecological/functional indices. (Interacts with Validation Module, Fusion Engine.)</w:t>
       </w:r>
     </w:p>
     <w:p>
@@ -9446,12 +9427,7 @@
         <w:spacing w:before="0" w:after="100" w:line="276" w:lineRule="auto"/>
       </w:pPr>
       <w:r>
-        <w:rPr>
-          <w:rFonts w:ascii="Calibri" w:hAnsi="Calibri"/>
-          <w:color w:val="1A202C"/>
-          <w:sz w:val="21"/>
-        </w:rPr>
-        <w:t>The Gut Microbiome Expert processes 40 bacterial taxa, 1 residual compositional component (Other_Taxa), and 9 derived ecological and functional indices. The model tensor input contains 49 features.</w:t>
+        <w:t>The Gut Microbiome Expert processes 41 bacterial taxa, 1 residual compositional component (Other_Taxa), and 9 derived ecological and functional indices. The model tensor input contains 49 features.</w:t>
       </w:r>
     </w:p>
     <w:tbl>

</xml_diff>